<commit_message>
[Validation] Browser feedback and server validation in a static SSR form
</commit_message>
<xml_diff>
--- a/Evidence/Browser Feedback and Server-Side Validation in Static SSR Forms.docx
+++ b/Evidence/Browser Feedback and Server-Side Validation in Static SSR Forms.docx
@@ -33,29 +33,26 @@
       <w:r>
         <w:t xml:space="preserve"> </w:t>
       </w:r>
-      <w:r>
-        <w:rPr>
-          <w:b/>
-          <w:bCs/>
-        </w:rPr>
-        <w:t xml:space="preserve">[Validation] Offloading work with the </w:t>
-      </w:r>
-      <w:proofErr w:type="spellStart"/>
-      <w:r>
-        <w:rPr>
-          <w:b/>
-          <w:bCs/>
-        </w:rPr>
-        <w:t>blazorwebworker</w:t>
-      </w:r>
-      <w:proofErr w:type="spellEnd"/>
-      <w:r>
-        <w:rPr>
-          <w:b/>
-          <w:bCs/>
-        </w:rPr>
-        <w:t xml:space="preserve"> template (#68818)</w:t>
-      </w:r>
+      <w:hyperlink r:id="rId5" w:history="1">
+        <w:r>
+          <w:rPr>
+            <w:rStyle w:val="Hyperlink"/>
+            <w:b/>
+            <w:bCs/>
+          </w:rPr>
+          <w:t>[Validation] Browser feedback and server validation in a static SSR form · Issue #69531 · dotnet/</w:t>
+        </w:r>
+        <w:proofErr w:type="spellStart"/>
+        <w:r>
+          <w:rPr>
+            <w:rStyle w:val="Hyperlink"/>
+            <w:b/>
+            <w:bCs/>
+          </w:rPr>
+          <w:t>aspnetcore</w:t>
+        </w:r>
+        <w:proofErr w:type="spellEnd"/>
+      </w:hyperlink>
     </w:p>
     <w:p>
       <w:r>
@@ -66,7 +63,10 @@
         <w:t>Build tested:</w:t>
       </w:r>
       <w:r>
-        <w:t xml:space="preserve"> 11.0.100-preview.7.26381.103</w:t>
+        <w:t xml:space="preserve"> </w:t>
+      </w:r>
+      <w:r>
+        <w:t>11.0.100-rc.1.26425.128</w:t>
       </w:r>
     </w:p>
     <w:p>
@@ -81,24 +81,8 @@
         <w:t xml:space="preserve"> </w:t>
       </w:r>
       <w:r>
-        <w:t xml:space="preserve">Interactive </w:t>
-      </w:r>
-      <w:proofErr w:type="spellStart"/>
-      <w:r>
-        <w:t>WebAssembly</w:t>
-      </w:r>
-      <w:proofErr w:type="spellEnd"/>
-      <w:r>
-        <w:t xml:space="preserve"> and </w:t>
-      </w:r>
-      <w:r>
-        <w:t xml:space="preserve">Standalone </w:t>
-      </w:r>
-      <w:proofErr w:type="spellStart"/>
-      <w:r>
-        <w:t>WebAssembly</w:t>
-      </w:r>
-      <w:proofErr w:type="spellEnd"/>
+        <w:t>Static SSR</w:t>
+      </w:r>
     </w:p>
     <w:p>
       <w:r>
@@ -164,6 +148,17 @@
       <w:r>
         <w:t xml:space="preserve"> </w:t>
       </w:r>
+      <w:hyperlink r:id="rId6" w:history="1">
+        <w:r>
+          <w:rPr>
+            <w:rStyle w:val="Hyperlink"/>
+          </w:rPr>
+          <w:t>https://github.com/Vinoth2562000/BlazorStaticSSRFormValidation</w:t>
+        </w:r>
+      </w:hyperlink>
+      <w:r>
+        <w:t xml:space="preserve"> </w:t>
+      </w:r>
     </w:p>
     <w:p>
       <w:r>
@@ -174,7 +169,7 @@
         <w:t>Outcome:</w:t>
       </w:r>
       <w:r>
-        <w:t xml:space="preserve"> Works with issues</w:t>
+        <w:t xml:space="preserve"> Works</w:t>
       </w:r>
     </w:p>
     <w:p/>
@@ -336,6 +331,13 @@
               </w:rPr>
               <w:t xml:space="preserve"> </w:t>
             </w:r>
+            <w:r>
+              <w:rPr>
+                <w:b/>
+                <w:bCs/>
+              </w:rPr>
+              <w:t>Static SSR</w:t>
+            </w:r>
           </w:p>
         </w:tc>
         <w:tc>
@@ -416,6 +418,13 @@
                 <w:bCs/>
               </w:rPr>
             </w:pPr>
+            <w:r>
+              <w:rPr>
+                <w:b/>
+                <w:bCs/>
+              </w:rPr>
+              <w:t>Static SSR</w:t>
+            </w:r>
           </w:p>
         </w:tc>
         <w:tc>
@@ -481,7 +490,11 @@
           </w:tcPr>
           <w:p>
             <w:r>
-              <w:t>With no native HTML constraints on those inputs, submitting a form that fails a built-in rule produces no POST or success confirmation.</w:t>
+              <w:t xml:space="preserve">With no native HTML constraints on those inputs, submitting a form that fails a built-in rule produces no </w:t>
+            </w:r>
+            <w:r>
+              <w:lastRenderedPageBreak/>
+              <w:t>POST or success confirmation.</w:t>
             </w:r>
           </w:p>
         </w:tc>
@@ -496,6 +509,14 @@
                 <w:bCs/>
               </w:rPr>
             </w:pPr>
+            <w:r>
+              <w:rPr>
+                <w:b/>
+                <w:bCs/>
+              </w:rPr>
+              <w:lastRenderedPageBreak/>
+              <w:t>Static SSR</w:t>
+            </w:r>
           </w:p>
         </w:tc>
         <w:tc>
@@ -557,7 +578,6 @@
           </w:tcPr>
           <w:p>
             <w:r>
-              <w:lastRenderedPageBreak/>
               <w:t>4</w:t>
             </w:r>
           </w:p>
@@ -583,6 +603,13 @@
                 <w:bCs/>
               </w:rPr>
             </w:pPr>
+            <w:r>
+              <w:rPr>
+                <w:b/>
+                <w:bCs/>
+              </w:rPr>
+              <w:t>Static SSR</w:t>
+            </w:r>
           </w:p>
         </w:tc>
         <w:tc>
@@ -599,6 +626,13 @@
                 <w:bCs/>
               </w:rPr>
             </w:pPr>
+            <w:r>
+              <w:rPr>
+                <w:b/>
+                <w:bCs/>
+              </w:rPr>
+              <w:t>Pass</w:t>
+            </w:r>
           </w:p>
         </w:tc>
         <w:tc>
@@ -615,6 +649,108 @@
                 <w:bCs/>
               </w:rPr>
             </w:pPr>
+            <w:proofErr w:type="spellStart"/>
+            <w:r>
+              <w:rPr>
+                <w:b/>
+                <w:bCs/>
+              </w:rPr>
+              <w:t>ValidSubmit_ServerConfirmation</w:t>
+            </w:r>
+            <w:proofErr w:type="spellEnd"/>
+          </w:p>
+        </w:tc>
+      </w:tr>
+      <w:tr>
+        <w:trPr>
+          <w:trHeight w:val="2690"/>
+        </w:trPr>
+        <w:tc>
+          <w:tcPr>
+            <w:tcW w:w="774" w:type="dxa"/>
+          </w:tcPr>
+          <w:p>
+            <w:r>
+              <w:t>5</w:t>
+            </w:r>
+          </w:p>
+        </w:tc>
+        <w:tc>
+          <w:tcPr>
+            <w:tcW w:w="2556" w:type="dxa"/>
+          </w:tcPr>
+          <w:p>
+            <w:r>
+              <w:t>A reserved name that passes the browser rules reaches the server, is rejected there, and shows the server-only error beside that field without a success confirmation.</w:t>
+            </w:r>
+          </w:p>
+        </w:tc>
+        <w:tc>
+          <w:tcPr>
+            <w:tcW w:w="2070" w:type="dxa"/>
+          </w:tcPr>
+          <w:p>
+            <w:pPr>
+              <w:rPr>
+                <w:b/>
+                <w:bCs/>
+              </w:rPr>
+            </w:pPr>
+            <w:r>
+              <w:rPr>
+                <w:b/>
+                <w:bCs/>
+              </w:rPr>
+              <w:t>Static SSR</w:t>
+            </w:r>
+          </w:p>
+        </w:tc>
+        <w:tc>
+          <w:tcPr>
+            <w:tcW w:w="1620" w:type="dxa"/>
+            <w:tcBorders>
+              <w:bottom w:val="single" w:sz="4" w:space="0" w:color="auto"/>
+            </w:tcBorders>
+          </w:tcPr>
+          <w:p>
+            <w:pPr>
+              <w:rPr>
+                <w:b/>
+                <w:bCs/>
+              </w:rPr>
+            </w:pPr>
+            <w:r>
+              <w:rPr>
+                <w:b/>
+                <w:bCs/>
+              </w:rPr>
+              <w:t>Pass</w:t>
+            </w:r>
+          </w:p>
+        </w:tc>
+        <w:tc>
+          <w:tcPr>
+            <w:tcW w:w="2430" w:type="dxa"/>
+            <w:tcBorders>
+              <w:bottom w:val="single" w:sz="4" w:space="0" w:color="auto"/>
+            </w:tcBorders>
+          </w:tcPr>
+          <w:p>
+            <w:pPr>
+              <w:rPr>
+                <w:b/>
+                <w:bCs/>
+              </w:rPr>
+            </w:pPr>
+            <w:proofErr w:type="spellStart"/>
+            <w:r>
+              <w:rPr>
+                <w:b/>
+                <w:bCs/>
+              </w:rPr>
+              <w:t>ServerOnlyReservedNameValidation</w:t>
+            </w:r>
+            <w:proofErr w:type="spellEnd"/>
           </w:p>
         </w:tc>
       </w:tr>
@@ -628,7 +764,7 @@
           </w:tcPr>
           <w:p>
             <w:r>
-              <w:t>5</w:t>
+              <w:t>6</w:t>
             </w:r>
           </w:p>
         </w:tc>
@@ -636,7 +772,11 @@
           <w:tcPr>
             <w:tcW w:w="2556" w:type="dxa"/>
           </w:tcPr>
-          <w:p/>
+          <w:p>
+            <w:r>
+              <w:t>The browser-feedback and server-POST outcomes still hold when running the published app.</w:t>
+            </w:r>
+          </w:p>
         </w:tc>
         <w:tc>
           <w:tcPr>
@@ -649,6 +789,13 @@
                 <w:bCs/>
               </w:rPr>
             </w:pPr>
+            <w:r>
+              <w:rPr>
+                <w:b/>
+                <w:bCs/>
+              </w:rPr>
+              <w:t>Static SSR (Published App)</w:t>
+            </w:r>
           </w:p>
         </w:tc>
         <w:tc>
@@ -665,6 +812,13 @@
                 <w:bCs/>
               </w:rPr>
             </w:pPr>
+            <w:r>
+              <w:rPr>
+                <w:b/>
+                <w:bCs/>
+              </w:rPr>
+              <w:t>Pass</w:t>
+            </w:r>
           </w:p>
         </w:tc>
         <w:tc>
@@ -681,197 +835,113 @@
                 <w:bCs/>
               </w:rPr>
             </w:pPr>
-          </w:p>
-        </w:tc>
-      </w:tr>
-      <w:tr>
-        <w:trPr>
-          <w:trHeight w:val="320"/>
-        </w:trPr>
-        <w:tc>
-          <w:tcPr>
-            <w:tcW w:w="774" w:type="dxa"/>
-          </w:tcPr>
-          <w:p>
-            <w:r>
-              <w:t>6</w:t>
-            </w:r>
-          </w:p>
-        </w:tc>
-        <w:tc>
-          <w:tcPr>
-            <w:tcW w:w="2556" w:type="dxa"/>
-          </w:tcPr>
-          <w:p/>
-        </w:tc>
-        <w:tc>
-          <w:tcPr>
-            <w:tcW w:w="2070" w:type="dxa"/>
-          </w:tcPr>
-          <w:p>
-            <w:pPr>
-              <w:rPr>
-                <w:b/>
-                <w:bCs/>
-              </w:rPr>
-            </w:pPr>
-          </w:p>
-        </w:tc>
-        <w:tc>
-          <w:tcPr>
-            <w:tcW w:w="1620" w:type="dxa"/>
-            <w:tcBorders>
-              <w:bottom w:val="single" w:sz="4" w:space="0" w:color="auto"/>
-            </w:tcBorders>
-          </w:tcPr>
-          <w:p>
-            <w:pPr>
-              <w:rPr>
-                <w:b/>
-                <w:bCs/>
-              </w:rPr>
-            </w:pPr>
-          </w:p>
-        </w:tc>
-        <w:tc>
-          <w:tcPr>
-            <w:tcW w:w="2430" w:type="dxa"/>
-            <w:tcBorders>
-              <w:bottom w:val="single" w:sz="4" w:space="0" w:color="auto"/>
-            </w:tcBorders>
-          </w:tcPr>
-          <w:p>
-            <w:pPr>
-              <w:rPr>
-                <w:b/>
-                <w:bCs/>
-              </w:rPr>
-            </w:pPr>
-          </w:p>
-        </w:tc>
-      </w:tr>
-      <w:tr>
-        <w:trPr>
-          <w:trHeight w:val="320"/>
-        </w:trPr>
-        <w:tc>
-          <w:tcPr>
-            <w:tcW w:w="774" w:type="dxa"/>
-          </w:tcPr>
-          <w:p>
-            <w:r>
-              <w:t>7</w:t>
-            </w:r>
-          </w:p>
-        </w:tc>
-        <w:tc>
-          <w:tcPr>
-            <w:tcW w:w="2556" w:type="dxa"/>
-          </w:tcPr>
-          <w:p/>
-        </w:tc>
-        <w:tc>
-          <w:tcPr>
-            <w:tcW w:w="2070" w:type="dxa"/>
-          </w:tcPr>
-          <w:p>
-            <w:pPr>
-              <w:rPr>
-                <w:b/>
-                <w:bCs/>
-              </w:rPr>
-            </w:pPr>
-          </w:p>
-        </w:tc>
-        <w:tc>
-          <w:tcPr>
-            <w:tcW w:w="1620" w:type="dxa"/>
-            <w:tcBorders>
-              <w:bottom w:val="single" w:sz="4" w:space="0" w:color="auto"/>
-            </w:tcBorders>
-          </w:tcPr>
-          <w:p>
-            <w:pPr>
-              <w:rPr>
-                <w:b/>
-                <w:bCs/>
-              </w:rPr>
-            </w:pPr>
-          </w:p>
-        </w:tc>
-        <w:tc>
-          <w:tcPr>
-            <w:tcW w:w="2430" w:type="dxa"/>
-            <w:tcBorders>
-              <w:bottom w:val="single" w:sz="4" w:space="0" w:color="auto"/>
-            </w:tcBorders>
-          </w:tcPr>
-          <w:p>
-            <w:pPr>
-              <w:rPr>
-                <w:b/>
-                <w:bCs/>
-              </w:rPr>
-            </w:pPr>
-          </w:p>
-        </w:tc>
-      </w:tr>
-      <w:tr>
-        <w:trPr>
-          <w:trHeight w:val="320"/>
-        </w:trPr>
-        <w:tc>
-          <w:tcPr>
-            <w:tcW w:w="774" w:type="dxa"/>
-          </w:tcPr>
-          <w:p>
-            <w:r>
-              <w:t>8</w:t>
-            </w:r>
-          </w:p>
-        </w:tc>
-        <w:tc>
-          <w:tcPr>
-            <w:tcW w:w="2556" w:type="dxa"/>
-          </w:tcPr>
-          <w:p/>
-        </w:tc>
-        <w:tc>
-          <w:tcPr>
-            <w:tcW w:w="2070" w:type="dxa"/>
-          </w:tcPr>
-          <w:p>
-            <w:pPr>
-              <w:rPr>
-                <w:b/>
-                <w:bCs/>
-              </w:rPr>
-            </w:pPr>
-          </w:p>
-        </w:tc>
-        <w:tc>
-          <w:tcPr>
-            <w:tcW w:w="1620" w:type="dxa"/>
-            <w:tcBorders>
-              <w:bottom w:val="single" w:sz="4" w:space="0" w:color="auto"/>
-            </w:tcBorders>
-          </w:tcPr>
-          <w:p>
-            <w:pPr>
-              <w:rPr>
-                <w:b/>
-                <w:bCs/>
-              </w:rPr>
-            </w:pPr>
-          </w:p>
-        </w:tc>
-        <w:tc>
-          <w:tcPr>
-            <w:tcW w:w="2430" w:type="dxa"/>
-            <w:tcBorders>
-              <w:bottom w:val="single" w:sz="4" w:space="0" w:color="auto"/>
-            </w:tcBorders>
-          </w:tcPr>
+            <w:r>
+              <w:rPr>
+                <w:b/>
+                <w:bCs/>
+              </w:rPr>
+              <w:t>Browser-Feedback-Invalid-Email-No-POST</w:t>
+            </w:r>
+            <w:r>
+              <w:rPr>
+                <w:b/>
+                <w:bCs/>
+              </w:rPr>
+              <w:t xml:space="preserve"> </w:t>
+            </w:r>
+          </w:p>
+          <w:p>
+            <w:pPr>
+              <w:rPr>
+                <w:b/>
+                <w:bCs/>
+              </w:rPr>
+            </w:pPr>
+          </w:p>
+          <w:p>
+            <w:pPr>
+              <w:rPr>
+                <w:b/>
+                <w:bCs/>
+              </w:rPr>
+            </w:pPr>
+            <w:r>
+              <w:rPr>
+                <w:b/>
+                <w:bCs/>
+              </w:rPr>
+              <w:t>Browser-Feedback-Email-Corrected</w:t>
+            </w:r>
+          </w:p>
+          <w:p>
+            <w:pPr>
+              <w:rPr>
+                <w:b/>
+                <w:bCs/>
+              </w:rPr>
+            </w:pPr>
+          </w:p>
+          <w:p>
+            <w:pPr>
+              <w:rPr>
+                <w:b/>
+                <w:bCs/>
+              </w:rPr>
+            </w:pPr>
+            <w:r>
+              <w:rPr>
+                <w:b/>
+                <w:bCs/>
+              </w:rPr>
+              <w:t>Server-POST-Reserved-Name-Validation</w:t>
+            </w:r>
+          </w:p>
+          <w:p>
+            <w:pPr>
+              <w:rPr>
+                <w:b/>
+                <w:bCs/>
+              </w:rPr>
+            </w:pPr>
+          </w:p>
+          <w:p>
+            <w:pPr>
+              <w:rPr>
+                <w:b/>
+                <w:bCs/>
+              </w:rPr>
+            </w:pPr>
+            <w:r>
+              <w:rPr>
+                <w:b/>
+                <w:bCs/>
+              </w:rPr>
+              <w:t>Server-Validation-Error-All-Empty-Fields</w:t>
+            </w:r>
+          </w:p>
+          <w:p>
+            <w:pPr>
+              <w:rPr>
+                <w:b/>
+                <w:bCs/>
+              </w:rPr>
+            </w:pPr>
+          </w:p>
+          <w:p>
+            <w:pPr>
+              <w:rPr>
+                <w:b/>
+                <w:bCs/>
+              </w:rPr>
+            </w:pPr>
+            <w:r>
+              <w:rPr>
+                <w:b/>
+                <w:bCs/>
+              </w:rPr>
+              <w:t>Successful-POST-Redirect-Success-Alert</w:t>
+            </w:r>
+          </w:p>
           <w:p>
             <w:pPr>
               <w:rPr>
@@ -1746,7 +1816,6 @@
   <w:style w:type="character" w:default="1" w:styleId="DefaultParagraphFont">
     <w:name w:val="Default Paragraph Font"/>
     <w:uiPriority w:val="1"/>
-    <w:semiHidden/>
     <w:unhideWhenUsed/>
   </w:style>
   <w:style w:type="table" w:default="1" w:styleId="TableNormal">
@@ -2088,6 +2157,18 @@
     <w:rPr>
       <w:color w:val="467886" w:themeColor="hyperlink"/>
       <w:u w:val="single"/>
+    </w:rPr>
+  </w:style>
+  <w:style w:type="character" w:styleId="UnresolvedMention">
+    <w:name w:val="Unresolved Mention"/>
+    <w:basedOn w:val="DefaultParagraphFont"/>
+    <w:uiPriority w:val="99"/>
+    <w:semiHidden/>
+    <w:unhideWhenUsed/>
+    <w:rsid w:val="00141A73"/>
+    <w:rPr>
+      <w:color w:val="605E5C"/>
+      <w:shd w:val="clear" w:color="auto" w:fill="E1DFDD"/>
     </w:rPr>
   </w:style>
 </w:styles>

</xml_diff>

<commit_message>
Align published evidence with tested revision
Co-authored-by: Copilot <223556219+Copilot@users.noreply.github.com>
</commit_message>
<xml_diff>
--- a/Evidence/Browser Feedback and Server-Side Validation in Static SSR Forms.docx
+++ b/Evidence/Browser Feedback and Server-Side Validation in Static SSR Forms.docx
@@ -93,6 +93,12 @@
       </w:hyperlink>
       <w:r>
         <w:t xml:space="preserve"> </w:t>
+      </w:r>
+    </w:p>
+    <w:p>
+      <w:pPr/>
+      <w:r>
+        <w:t xml:space="preserve">Revision identity: The tested application source and published assembly are a1056aca8375b6d1ccda40c69fcf2f4bc724f2c8. Clean-checkout, restore, Release build, publish, startup, assembly ProductVersion, and SHA-256 evidence are attached under Evidence/Reproducibility. GitHub HEAD may be a later evidence-only commit that packages recordings, HAR files, logs, published output, and this report without changing the tested application source.</w:t>
       </w:r>
     </w:p>
     <w:p>

</xml_diff>